<commit_message>
Manuales: guía de Gof en Reclamos sin CEDI
Paso 1 con el origen ya en Tienda, sin la División de CEDI en el
paso 2, y capturas nuevas del formulario con la vista de Gof y un
Excel de la plantilla Tienda.

Co-Authored-By: Claude Opus 5.5 <noreply@anthropic.com>
</commit_message>
<xml_diff>
--- a/Manuales-por-rol/Guia rapida - Gof - Reclamos.docx
+++ b/Manuales-por-rol/Guia rapida - Gof - Reclamos.docx
@@ -39,7 +39,7 @@
         <w:rPr>
           <w:color w:val="666666"/>
         </w:rPr>
-        <w:t xml:space="preserve">Crear un reclamo y llevarlo hasta contabilidad · 14 de octubre de 2026</w:t>
+        <w:t xml:space="preserve">Crear un reclamo y llevarlo hasta contabilidad · 15 de octubre de 2026</w:t>
       </w:r>
     </w:p>
     <w:p>
@@ -293,7 +293,7 @@
         <w:t xml:space="preserve">El Excel del reclamo</w:t>
       </w:r>
       <w:r>
-        <w:t xml:space="preserve"> (plantilla Tienda o CEDI). Es obligatorio.</w:t>
+        <w:t xml:space="preserve"> (plantilla Tienda). Es obligatorio. Gof solo crea reclamos de Tienda, no de CEDI.</w:t>
       </w:r>
     </w:p>
     <w:p>
@@ -506,7 +506,7 @@
         <w:t xml:space="preserve">Paso 1 · Origen y Excel: </w:t>
       </w:r>
       <w:r>
-        <w:t xml:space="preserve">elige </w:t>
+        <w:t xml:space="preserve">el origen ya viene en </w:t>
       </w:r>
       <w:r>
         <w:rPr>
@@ -516,17 +516,10 @@
         <w:t xml:space="preserve">Tienda</w:t>
       </w:r>
       <w:r>
-        <w:t xml:space="preserve"> o </w:t>
-      </w:r>
-      <w:r>
-        <w:rPr>
-          <w:b/>
-          <w:bCs/>
-        </w:rPr>
-        <w:t xml:space="preserve">CEDI</w:t>
-      </w:r>
-      <w:r>
-        <w:t xml:space="preserve"> y sube el Excel. El portal lee los productos, revisa los códigos en SAP, sugiere el tipo de reclamo y llena varios campos solo (marcados </w:t>
+        <w:t xml:space="preserve"> (Gof no hace reclamos de CEDI, por eso no sale esa opción). </w:t>
+      </w:r>
+      <w:r>
+        <w:t xml:space="preserve">Sube el Excel de la plantilla Tienda. El portal lee los productos, revisa los códigos en SAP, sugiere el tipo de reclamo y llena varios campos solo (marcados </w:t>
       </w:r>
       <w:r>
         <w:rPr>
@@ -629,27 +622,17 @@
         <w:t xml:space="preserve">«Te falta: …»</w:t>
       </w:r>
       <w:r>
-        <w:t xml:space="preserve">. En CEDI la </w:t>
+        <w:t xml:space="preserve">. La </w:t>
       </w:r>
       <w:r>
         <w:rPr>
           <w:b/>
           <w:bCs/>
         </w:rPr>
-        <w:t xml:space="preserve">División</w:t>
-      </w:r>
-      <w:r>
-        <w:t xml:space="preserve"> es obligatoria; en Tienda, la </w:t>
-      </w:r>
-      <w:r>
-        <w:rPr>
-          <w:b/>
-          <w:bCs/>
-        </w:rPr>
         <w:t xml:space="preserve">Sucursal</w:t>
       </w:r>
       <w:r>
-        <w:t xml:space="preserve">.</w:t>
+        <w:t xml:space="preserve"> es obligatoria.</w:t>
       </w:r>
     </w:p>
     <w:p>
@@ -661,7 +644,7 @@
       <w:r>
         <w:drawing>
           <wp:inline distT="0" distB="0" distL="0" distR="0">
-            <wp:extent cx="4000500" cy="2619375"/>
+            <wp:extent cx="4000500" cy="2491201"/>
             <wp:effectExtent t="0" r="0" b="0" l="0"/>
             <wp:docPr id="3" name="cap2/4-paso2.png" descr="Datos del reclamo: «Te falta» dice lo que queda por completar." title="Datos del reclamo: «Te falta» dice lo que queda por completar."/>
             <wp:cNvGraphicFramePr>
@@ -686,7 +669,7 @@
                   <pic:spPr bwMode="auto">
                     <a:xfrm>
                       <a:off x="0" y="0"/>
-                      <a:ext cx="4000500" cy="2619375"/>
+                      <a:ext cx="4000500" cy="2491201"/>
                     </a:xfrm>
                     <a:prstGeom prst="rect">
                       <a:avLst/>

</xml_diff>

<commit_message>
Reclamos: la sección 4 del formulario pasa a «Fotos y comentario»
- Los adjuntos del reclamo aceptan fotos (JPG, PNG o WebP) además de
  Excel y PDF; el tipo real se revisa por firma (tipo «imagen»).
- Formulario: «Fotos y comentario», con miniaturas y vista previa de las
  fotos. Los PDF siguen pasando a Documentos SAP.
- Detalle: las fotos salen en Adjuntos con su visor y se pueden subir
  ahí también; al enviar a contabilidad van como «Foto del reclamo».
- Productos Dañados sigue aceptando solo Excel o PDF.
- Guía de Gof en Reclamos: paso 4 actualizado.

Co-Authored-By: Claude Opus 5.5 <noreply@anthropic.com>
</commit_message>
<xml_diff>
--- a/Manuales-por-rol/Guia rapida - Gof - Reclamos.docx
+++ b/Manuales-por-rol/Guia rapida - Gof - Reclamos.docx
@@ -926,10 +926,10 @@
           <w:b/>
           <w:bCs/>
         </w:rPr>
-        <w:t xml:space="preserve">Paso 4 · Archivos y comentario (opcional): </w:t>
-      </w:r>
-      <w:r>
-        <w:t xml:space="preserve">Excel adicionales y un comentario. Los PDF van siempre en Documentos SAP.</w:t>
+        <w:t xml:space="preserve">Paso 4 · Fotos y comentario (opcional): </w:t>
+      </w:r>
+      <w:r>
+        <w:t xml:space="preserve">agrega fotos del producto o de la mercancía (JPG, PNG o WebP) y un comentario. También acepta Excel; los PDF pasan siempre a Documentos SAP.</w:t>
       </w:r>
     </w:p>
     <w:p>

</xml_diff>